<commit_message>
Add local-run steps to setup guide
</commit_message>
<xml_diff>
--- a/Org_Analyser_Setup_Guide.docx
+++ b/Org_Analyser_Setup_Guide.docx
@@ -1251,6 +1251,106 @@
           <w:color w:val="555555"/>
         </w:rPr>
         <w:t xml:space="preserve">There is a lighter version that skips the deepest quality-scoring step. Use run_org_pipeline_no_quality.py instead of run_org_pipeline.py with the exact same flags if you want a faster, simpler run.</w:t>
+      </w:r>
+    </w:p>
+    <w:p>
+      <w:pPr/>
+      <w:r>
+        <w:rPr>
+          <w:rFonts w:ascii="Times" w:hAnsi="Times"/>
+          <w:sz w:val="24"/>
+        </w:rPr>
+        <w:t>Step 5b: Analyzing code already saved on your computer (no GitHub or GitLab needed)</w:t>
+      </w:r>
+    </w:p>
+    <w:p>
+      <w:pPr/>
+      <w:r>
+        <w:rPr>
+          <w:rFonts w:ascii="Times" w:hAnsi="Times"/>
+          <w:sz w:val="24"/>
+        </w:rPr>
+        <w:t>If the projects you want to look at are already on your computer, you can analyze them directly. You do not need a GitHub or GitLab account or token, and your code is never uploaded to those websites — the tool simply reads each project’s saved history right from your computer.</w:t>
+      </w:r>
+    </w:p>
+    <w:p>
+      <w:pPr/>
+      <w:r>
+        <w:rPr>
+          <w:rFonts w:ascii="Times" w:hAnsi="Times"/>
+          <w:sz w:val="24"/>
+        </w:rPr>
+        <w:t>To analyze one project folder</w:t>
+      </w:r>
+    </w:p>
+    <w:p>
+      <w:pPr/>
+      <w:r>
+        <w:rPr>
+          <w:rFonts w:ascii="Times" w:hAnsi="Times"/>
+          <w:sz w:val="20"/>
+        </w:rPr>
+        <w:t>python run_org_pipeline.py --local-repos-dir "/path/to/your-project" --tokens-file tokens --local-only</w:t>
+      </w:r>
+    </w:p>
+    <w:p>
+      <w:pPr/>
+      <w:r>
+        <w:rPr>
+          <w:rFonts w:ascii="Times" w:hAnsi="Times"/>
+          <w:sz w:val="24"/>
+        </w:rPr>
+        <w:t>To analyze a folder that holds several project folders</w:t>
+      </w:r>
+    </w:p>
+    <w:p>
+      <w:pPr/>
+      <w:r>
+        <w:rPr>
+          <w:rFonts w:ascii="Times" w:hAnsi="Times"/>
+          <w:sz w:val="20"/>
+        </w:rPr>
+        <w:t>python run_org_pipeline.py --local-repos-dir "/path/to/folder-of-projects" --tokens-file tokens --local-only</w:t>
+      </w:r>
+    </w:p>
+    <w:p>
+      <w:pPr/>
+      <w:r>
+        <w:rPr>
+          <w:rFonts w:ascii="Times" w:hAnsi="Times"/>
+          <w:sz w:val="24"/>
+        </w:rPr>
+        <w:t>Replace the path inside the quotation marks with the real location of your project(s).</w:t>
+      </w:r>
+    </w:p>
+    <w:p>
+      <w:pPr/>
+      <w:r>
+        <w:rPr>
+          <w:rFonts w:ascii="Times" w:hAnsi="Times"/>
+          <w:sz w:val="24"/>
+        </w:rPr>
+        <w:t>TIP: On a Mac, instead of typing the path, you can drag the folder from Finder straight into the Terminal window — it will paste the correct path for you. Keep the quotation marks if the path has spaces in it.</w:t>
+      </w:r>
+    </w:p>
+    <w:p>
+      <w:pPr/>
+      <w:r>
+        <w:rPr>
+          <w:rFonts w:ascii="Times" w:hAnsi="Times"/>
+          <w:sz w:val="24"/>
+        </w:rPr>
+        <w:t>NOTE: “--local-only” keeps the whole run on your computer. It skips the Pull Request parts of the report (those live online) and will not contact GitHub or GitLab at all, even if the project was originally downloaded from one of them.</w:t>
+      </w:r>
+    </w:p>
+    <w:p>
+      <w:pPr/>
+      <w:r>
+        <w:rPr>
+          <w:rFonts w:ascii="Times" w:hAnsi="Times"/>
+          <w:sz w:val="24"/>
+        </w:rPr>
+        <w:t>NOTE: If your “tokens” file has an OpenAI or Azure key, the tool uses that AI service to help judge code quality — it sends small code snippets to it, with any passwords or keys removed first. If you leave that key blank, those AI steps are skipped and nothing at all leaves your computer.</w:t>
       </w:r>
     </w:p>
     <w:p>

</xml_diff>